<commit_message>
docs: align surround view plan with audit
</commit_message>
<xml_diff>
--- a/docs/Концепция_магистерской_диссертации_3D_Surround_View.docx
+++ b/docs/Концепция_магистерской_диссертации_3D_Surround_View.docx
@@ -4,1008 +4,875 @@
   <w:body>
     <w:p>
       <w:pPr>
-        <w:spacing w:before="1400"/>
-        <w:jc w:val="center"/>
+        <w:pStyle w:val="Title"/>
+        <w:jc w:val="left"/>
+        <w:spacing w:after="100" w:line="276" w:lineRule="auto"/>
+        <w:widowControl/>
+        <w:keepNext/>
       </w:pPr>
       <w:r>
-        <w:rPr>
-          <w:rFonts w:ascii="Times New Roman" w:hAnsi="Times New Roman" w:eastAsia="Times New Roman"/>
-          <w:b/>
-          <w:sz w:val="36"/>
-        </w:rPr>
         <w:t>КОНЦЕПЦИЯ МАГИСТЕРСКОЙ ДИССЕРТАЦИИ</w:t>
       </w:r>
     </w:p>
     <w:p>
       <w:pPr>
-        <w:spacing w:before="760"/>
-        <w:jc w:val="center"/>
+        <w:pStyle w:val="Subtitle"/>
+        <w:jc w:val="left"/>
+        <w:spacing w:after="100" w:line="276" w:lineRule="auto"/>
+        <w:widowControl/>
+        <w:keepNext/>
       </w:pPr>
       <w:r>
-        <w:rPr>
-          <w:rFonts w:ascii="Times New Roman" w:hAnsi="Times New Roman" w:eastAsia="Times New Roman"/>
-          <w:b/>
-          <w:sz w:val="32"/>
-        </w:rPr>
-        <w:t>«Разработка GPU-ускоренной подсистемы интерактивного трехмерного кругового обзора автомобиля на основе параметрической проекционной поверхности»</w:t>
+        <w:t>Разработка и исследование GPU-ускоренной подсистемы интерактивного трёхмерного кругового обзора автомобиля на основе параметрической проекционной поверхности</w:t>
       </w:r>
     </w:p>
     <w:p>
       <w:pPr>
-        <w:spacing w:before="760"/>
-        <w:jc w:val="center"/>
+        <w:jc w:val="left"/>
+        <w:spacing w:after="100" w:line="276" w:lineRule="auto"/>
+        <w:widowControl/>
       </w:pPr>
       <w:r>
-        <w:rPr>
-          <w:rFonts w:ascii="Times New Roman" w:hAnsi="Times New Roman" w:eastAsia="Times New Roman"/>
-          <w:i/>
-          <w:sz w:val="28"/>
-        </w:rPr>
-        <w:t>Направление: автомобильные программные системы / компьютерная графика / GPU-ускорение</w:t>
+        <w:t>Направление: автомобильные программные системы / компьютерная графика / GPU-ускорение.</w:t>
       </w:r>
     </w:p>
     <w:p>
       <w:pPr>
-        <w:spacing w:before="200"/>
-        <w:jc w:val="center"/>
+        <w:jc w:val="left"/>
+        <w:spacing w:after="100" w:line="276" w:lineRule="auto"/>
+        <w:widowControl/>
       </w:pPr>
       <w:r>
-        <w:rPr>
-          <w:rFonts w:ascii="Times New Roman" w:hAnsi="Times New Roman" w:eastAsia="Times New Roman"/>
-          <w:i/>
-          <w:sz w:val="28"/>
-        </w:rPr>
-        <w:t>Предлагаемый стек: C++20/23, Linux, CMake, OpenGL/Vulkan, GLSL/SPIR-V, SDL3/Qt</w:t>
-      </w:r>
-    </w:p>
-    <w:p>
-      <w:pPr>
-        <w:spacing w:before="2600"/>
-        <w:jc w:val="center"/>
-      </w:pPr>
-      <w:r>
-        <w:rPr>
-          <w:rFonts w:ascii="Times New Roman" w:hAnsi="Times New Roman" w:eastAsia="Times New Roman"/>
-          <w:sz w:val="26"/>
-        </w:rPr>
-        <w:t>Рабочая версия для обсуждения с научным руководителем</w:t>
-      </w:r>
-    </w:p>
-    <w:p>
-      <w:r>
-        <w:br w:type="page"/>
+        <w:t>Рабочая редакция от 19 сентября 2026 года по документу «Аудит и план 3D Surround View». Постановка и критерии предназначены для обсуждения с научным руководителем. Реализация, аппаратура и экспериментальные результаты этой редакцией не подтверждаются.</w:t>
       </w:r>
     </w:p>
     <w:p>
       <w:pPr>
         <w:pStyle w:val="Heading1"/>
+        <w:jc w:val="left"/>
+        <w:spacing w:after="100" w:line="276" w:lineRule="auto"/>
+        <w:widowControl/>
         <w:keepNext/>
-        <w:spacing w:after="120" w:before="240"/>
       </w:pPr>
       <w:r>
-        <w:t>1. Общая постановка работы</w:t>
+        <w:t>1. Проблема и ограничения известных решений</w:t>
       </w:r>
     </w:p>
     <w:p>
       <w:pPr>
-        <w:spacing w:line="360" w:lineRule="auto" w:after="60"/>
-        <w:ind w:firstLine="709"/>
-        <w:jc w:val="both"/>
+        <w:jc w:val="left"/>
+        <w:spacing w:after="100" w:line="276" w:lineRule="auto"/>
+        <w:widowControl/>
       </w:pPr>
       <w:r>
-        <w:rPr>
-          <w:rFonts w:ascii="Times New Roman" w:hAnsi="Times New Roman" w:eastAsia="Times New Roman"/>
-          <w:sz w:val="28"/>
-        </w:rPr>
-        <w:t>Работа посвящена разработке программной подсистемы Automotive 3D Surround View, предназначенной для формирования интерактивного трехмерного представления окружающего пространства транспортного средства по изображениям нескольких широкоугольных камер. В отличие от демонстрационных решений с жестко заданной геометрией, разрабатываемая подсистема должна формировать проекционную конфигурацию на основе параметров транспортного средства, положения камер и их калибровочных характеристик, а основные этапы обработки должны быть ориентированы на выполнение средствами GPU.</w:t>
+        <w:t>Система проекционного 3D Surround View отображает изображения четырёх широкоугольных физических камер на условную трёхмерную поверхность и формирует вид из положения виртуальной камеры. Подбор поверхности и её сеточного представления влияет на ошибку отображения и стоимость рендеринга. Требуется количественно оценить этот компромисс для нескольких конфигураций автомобиля и камер.</w:t>
       </w:r>
     </w:p>
     <w:p>
       <w:pPr>
-        <w:spacing w:line="360" w:lineRule="auto" w:after="60"/>
-        <w:ind w:firstLine="709"/>
-        <w:jc w:val="both"/>
+        <w:jc w:val="left"/>
+        <w:spacing w:after="100" w:line="276" w:lineRule="auto"/>
+        <w:widowControl/>
       </w:pPr>
       <w:r>
-        <w:rPr>
-          <w:rFonts w:ascii="Times New Roman" w:hAnsi="Times New Roman" w:eastAsia="Times New Roman"/>
-          <w:sz w:val="28"/>
-        </w:rPr>
-        <w:t>Ключевой акцент проекта делается на трех свойствах: параметрическом формировании трехмерной проекционной поверхности; GPU-ориентированной организации графического конвейера; интерактивной визуализации полученной трехмерной сцены с произвольного положения виртуальной камеры. Эти свойства рассматриваются не как независимые функции, а как части единой архитектуры программной подсистемы.</w:t>
+        <w:t>Bowl-поверхность, GPU-рендеринг, изменяемый виртуальный ракурс и предварительные таблицы отображения уже описаны в решении Texas Instruments 2015 года [1, с. 9–13]. В TI Vision Apps разделены подготовка LUT и обработка входов [2]. Поэтому сами по себе эти функции, конфигурируемость и разделение предварительных и покадровых вычислений не обосновывают научную новизну. Это сопоставление с ближайшими рассмотренными аналогами, а не завершённый обзор публикаций.</w:t>
+      </w:r>
+    </w:p>
+    <w:p>
+      <w:pPr>
+        <w:jc w:val="left"/>
+        <w:spacing w:after="100" w:line="276" w:lineRule="auto"/>
+        <w:widowControl/>
+      </w:pPr>
+      <w:r>
+        <w:t>Условная поверхность не является восстановленной геометрией окружения. Смена ракурса не восстанавливает скрытые стороны препятствий. Вертикальные объекты могут растягиваться, смещаться и двоиться в перекрытиях. В работе используется интерактивное изменение ракурса в заданной допустимой области; неограниченное произвольное перемещение наблюдателя не заявляется.</w:t>
       </w:r>
     </w:p>
     <w:p>
       <w:pPr>
         <w:pStyle w:val="Heading1"/>
+        <w:jc w:val="left"/>
+        <w:spacing w:after="100" w:line="276" w:lineRule="auto"/>
+        <w:widowControl/>
         <w:keepNext/>
-        <w:spacing w:before="240" w:after="120"/>
       </w:pPr>
       <w:r>
-        <w:t>2. Тема магистерской диссертации</w:t>
+        <w:t>2. Цель работы</w:t>
       </w:r>
     </w:p>
     <w:p>
       <w:pPr>
-        <w:spacing w:before="120" w:after="160"/>
-        <w:jc w:val="center"/>
+        <w:jc w:val="left"/>
+        <w:spacing w:after="100" w:line="276" w:lineRule="auto"/>
+        <w:widowControl/>
       </w:pPr>
       <w:r>
-        <w:rPr>
-          <w:rFonts w:ascii="Times New Roman" w:hAnsi="Times New Roman" w:eastAsia="Times New Roman"/>
-          <w:b/>
-          <w:sz w:val="30"/>
-        </w:rPr>
-        <w:t>«Разработка GPU-ускоренной подсистемы интерактивного трехмерного кругового обзора автомобиля на основе параметрической проекционной поверхности»</w:t>
-      </w:r>
-    </w:p>
-    <w:p>
-      <w:pPr>
-        <w:spacing w:line="360" w:lineRule="auto" w:after="60"/>
-        <w:ind w:firstLine="709"/>
-        <w:jc w:val="both"/>
-      </w:pPr>
-      <w:r>
-        <w:rPr>
-          <w:rFonts w:ascii="Times New Roman" w:hAnsi="Times New Roman" w:eastAsia="Times New Roman"/>
-          <w:sz w:val="28"/>
-        </w:rPr>
-        <w:t>Формулировка темы подчеркивает практический результат работы — законченную программную подсистему, пригодную для интеграции в автомобильную программную экосистему. При этом она не заявляет создание принципиально нового метода кругового обзора, а фиксирует основные особенности разрабатываемого решения: трехмерное представление, параметрическую геометрию и GPU-ускоренный конвейер.</w:t>
+        <w:t>Разработать подсистему интерактивной визуализации кругового обзора по изображениям четырёх fisheye-камер и экспериментально определить влияние формы и дискретизации проекционной поверхности на точность отображения, время рендеринга и задержку изменения виртуального ракурса на выбранной вычислительной платформе.</w:t>
       </w:r>
     </w:p>
     <w:p>
       <w:pPr>
         <w:pStyle w:val="Heading1"/>
+        <w:jc w:val="left"/>
+        <w:spacing w:after="100" w:line="276" w:lineRule="auto"/>
+        <w:widowControl/>
         <w:keepNext/>
-        <w:spacing w:before="240" w:after="120"/>
       </w:pPr>
       <w:r>
-        <w:t>3. Цель работы</w:t>
+        <w:t>3. Объект и предмет исследования</w:t>
       </w:r>
     </w:p>
     <w:p>
       <w:pPr>
-        <w:spacing w:line="360" w:lineRule="auto" w:after="60"/>
-        <w:ind w:firstLine="709"/>
-        <w:jc w:val="both"/>
+        <w:jc w:val="left"/>
+        <w:spacing w:after="100" w:line="276" w:lineRule="auto"/>
+        <w:widowControl/>
       </w:pPr>
       <w:r>
-        <w:rPr>
-          <w:rFonts w:ascii="Times New Roman" w:hAnsi="Times New Roman" w:eastAsia="Times New Roman"/>
-          <w:sz w:val="28"/>
-        </w:rPr>
-        <w:t>Цель работы — разработать GPU-ускоренную программную подсистему формирования интерактивного трехмерного кругового обзора окружающего пространства автомобиля по данным многокамерной системы, обеспечивающую параметрическое построение проекционной поверхности в зависимости от геометрии транспортного средства и расположения камер, а также визуализацию результата с произвольного положения виртуальной камеры в режиме реального времени.</w:t>
+        <w:t>Объект — процесс формирования интерактивного визуального представления окружения автомобиля по данным многокамерной системы.</w:t>
+      </w:r>
+    </w:p>
+    <w:p>
+      <w:pPr>
+        <w:jc w:val="left"/>
+        <w:spacing w:after="100" w:line="276" w:lineRule="auto"/>
+        <w:widowControl/>
+      </w:pPr>
+      <w:r>
+        <w:t>Предмет — параметрические модели проекционной поверхности, способы её дискретизации и GPU-отображения изображений физических камер, влияющие на геометрическую точность и быстродействие интерактивного кругового обзора.</w:t>
       </w:r>
     </w:p>
     <w:p>
       <w:pPr>
         <w:pStyle w:val="Heading1"/>
+        <w:jc w:val="left"/>
+        <w:spacing w:after="100" w:line="276" w:lineRule="auto"/>
+        <w:widowControl/>
         <w:keepNext/>
-        <w:spacing w:before="240" w:after="120"/>
       </w:pPr>
       <w:r>
-        <w:t>4. Объект и предмет исследования</w:t>
+        <w:t>4. Исследовательский вопрос и гипотеза</w:t>
       </w:r>
     </w:p>
     <w:p>
       <w:pPr>
-        <w:spacing w:line="360" w:lineRule="auto" w:after="100"/>
+        <w:jc w:val="left"/>
+        <w:spacing w:after="100" w:line="276" w:lineRule="auto"/>
+        <w:widowControl/>
       </w:pPr>
       <w:r>
-        <w:rPr>
-          <w:rFonts w:ascii="Times New Roman" w:hAnsi="Times New Roman" w:eastAsia="Times New Roman"/>
-          <w:b/>
-          <w:sz w:val="28"/>
-        </w:rPr>
-        <w:t xml:space="preserve">Объект исследования — </w:t>
-      </w:r>
-      <w:r>
-        <w:rPr>
-          <w:rFonts w:ascii="Times New Roman" w:hAnsi="Times New Roman" w:eastAsia="Times New Roman"/>
-          <w:sz w:val="28"/>
-        </w:rPr>
-        <w:t>процесс формирования трехмерного представления окружающего пространства транспортного средства по данным нескольких широкоугольных камер.</w:t>
+        <w:t>Исследовательский вопрос: как выбирать дискретизацию параметрической bowl-поверхности для заданного расположения физических камер и диапазона виртуальных ракурсов, чтобы ограничивать численно оценённую ошибку отображения при заданном бюджете GPU-времени?</w:t>
       </w:r>
     </w:p>
     <w:p>
       <w:pPr>
-        <w:spacing w:line="360" w:lineRule="auto" w:after="100"/>
+        <w:jc w:val="left"/>
+        <w:spacing w:after="100" w:line="276" w:lineRule="auto"/>
+        <w:widowControl/>
       </w:pPr>
       <w:r>
-        <w:rPr>
-          <w:rFonts w:ascii="Times New Roman" w:hAnsi="Times New Roman" w:eastAsia="Times New Roman"/>
-          <w:b/>
-          <w:sz w:val="28"/>
-        </w:rPr>
-        <w:t xml:space="preserve">Предмет исследования — </w:t>
+        <w:t>Проверяемая гипотеза: при одинаковом численно проверенном пределе ошибки проекции статическая сетка, учитывающая конфигурацию камер, может требовать меньше треугольников либо меньше GPU-времени, чем равномерная сетка. Форму поверхности задаёт конфигурация; критерий ошибки определяет плотность сетки при подготовке. Восстановление глубины и динамическая перестройка формы по видео для этого не требуются.</w:t>
       </w:r>
+    </w:p>
+    <w:p>
+      <w:pPr>
+        <w:jc w:val="left"/>
+        <w:spacing w:after="100" w:line="276" w:lineRule="auto"/>
+        <w:widowControl/>
+      </w:pPr>
       <w:r>
-        <w:rPr>
-          <w:rFonts w:ascii="Times New Roman" w:hAnsi="Times New Roman" w:eastAsia="Times New Roman"/>
-          <w:sz w:val="28"/>
-        </w:rPr>
-        <w:t>методы параметрического построения трехмерной проекционной поверхности, проецирования изображений широкоугольных камер на данную поверхность, организации GPU-ускоренного графического конвейера и интерактивной визуализации сформированного кругового обзора.</w:t>
+        <w:t>Число треугольников и время GPU оцениваются отдельно: если доминирует фрагментная стадия, уменьшение сетки может не ускорить рендер. Отсутствие выигрыша является допустимым результатом при корректной методике и ограниченных выводах.</w:t>
       </w:r>
     </w:p>
     <w:p>
       <w:pPr>
         <w:pStyle w:val="Heading1"/>
+        <w:jc w:val="left"/>
+        <w:spacing w:after="100" w:line="276" w:lineRule="auto"/>
+        <w:widowControl/>
         <w:keepNext/>
-        <w:spacing w:before="240" w:after="120"/>
       </w:pPr>
       <w:r>
-        <w:t>5. Задачи, решаемые в проекте</w:t>
+        <w:t>5. Задачи исследования</w:t>
       </w:r>
     </w:p>
     <w:p>
       <w:pPr>
-        <w:pStyle w:val="ListNumber"/>
-        <w:spacing w:after="60" w:line="276" w:lineRule="auto"/>
-        <w:ind w:left="0" w:hanging="357"/>
+        <w:pStyle w:val="ListParagraph"/>
+        <w:jc w:val="left"/>
+        <w:spacing w:after="100" w:line="276" w:lineRule="auto"/>
+        <w:widowControl/>
+        <w:numPr>
+          <w:ilvl w:val="0"/>
+          <w:numId w:val="13"/>
+        </w:numPr>
+        <w:ind w:left="480" w:hanging="480"/>
       </w:pPr>
       <w:r>
-        <w:rPr>
-          <w:rFonts w:ascii="Times New Roman" w:hAnsi="Times New Roman" w:eastAsia="Times New Roman"/>
-          <w:sz w:val="28"/>
-        </w:rPr>
-        <w:t>Провести анализ существующих подходов к построению Automotive Surround View: двухмерных Bird’s Eye View решений, трехмерных систем с фиксированной проекционной поверхностью, адаптивных поверхностей, способов смешивания изображений и вариантов GPU-ускоренной реализации.</w:t>
+        <w:t>Проанализировать близкие решения Surround View, проекционные поверхности и способы дискретизации; уточнить сравнимый baseline, границы и возможное отличие предлагаемой методики.</w:t>
       </w:r>
     </w:p>
     <w:p>
       <w:pPr>
-        <w:pStyle w:val="ListNumber"/>
-        <w:spacing w:after="60" w:line="276" w:lineRule="auto"/>
-        <w:ind w:left="0" w:hanging="357"/>
+        <w:pStyle w:val="ListParagraph"/>
+        <w:jc w:val="left"/>
+        <w:spacing w:after="100" w:line="276" w:lineRule="auto"/>
+        <w:widowControl/>
+        <w:numPr>
+          <w:ilvl w:val="0"/>
+          <w:numId w:val="13"/>
+        </w:numPr>
+        <w:ind w:left="480" w:hanging="480"/>
       </w:pPr>
       <w:r>
-        <w:rPr>
-          <w:rFonts w:ascii="Times New Roman" w:hAnsi="Times New Roman" w:eastAsia="Times New Roman"/>
-          <w:sz w:val="28"/>
-        </w:rPr>
-        <w:t>Сформировать функциональные и нефункциональные требования к разрабатываемой подсистеме с учетом особенностей целевой автомобильной программной экосистемы, требуемой производительности, конфигурируемости и возможности интерактивного трехмерного отображения.</w:t>
+        <w:t>Определить математическую модель камеры и поверхности, координатные соглашения, область применимости и метрики; подготовить данные и независимый CPU-эталон.</w:t>
       </w:r>
     </w:p>
     <w:p>
       <w:pPr>
-        <w:pStyle w:val="ListNumber"/>
-        <w:spacing w:after="60" w:line="276" w:lineRule="auto"/>
-        <w:ind w:left="0" w:hanging="357"/>
+        <w:pStyle w:val="ListParagraph"/>
+        <w:jc w:val="left"/>
+        <w:spacing w:after="100" w:line="276" w:lineRule="auto"/>
+        <w:widowControl/>
+        <w:numPr>
+          <w:ilvl w:val="0"/>
+          <w:numId w:val="13"/>
+        </w:numPr>
+        <w:ind w:left="480" w:hanging="480"/>
       </w:pPr>
       <w:r>
-        <w:rPr>
-          <w:rFonts w:ascii="Times New Roman" w:hAnsi="Times New Roman" w:eastAsia="Times New Roman"/>
-          <w:sz w:val="28"/>
-        </w:rPr>
-        <w:t>Разработать программную архитектуру подсистемы с разделением источников видеоданных, калибровочных данных, генерации проекционной геометрии, графических ресурсов, этапов рендеринга и пользовательского представления.</w:t>
+        <w:t>Реализовать базовый GPU-конвейер четырёх камер с равномерной bowl-сеткой, валидностью, нормализованным смешиванием и виртуальной камерой.</w:t>
       </w:r>
     </w:p>
     <w:p>
       <w:pPr>
-        <w:pStyle w:val="ListNumber"/>
-        <w:spacing w:after="60" w:line="276" w:lineRule="auto"/>
-        <w:ind w:left="0" w:hanging="357"/>
+        <w:pStyle w:val="ListParagraph"/>
+        <w:jc w:val="left"/>
+        <w:spacing w:after="100" w:line="276" w:lineRule="auto"/>
+        <w:widowControl/>
+        <w:numPr>
+          <w:ilvl w:val="0"/>
+          <w:numId w:val="13"/>
+        </w:numPr>
+        <w:ind w:left="480" w:hanging="480"/>
       </w:pPr>
       <w:r>
-        <w:rPr>
-          <w:rFonts w:ascii="Times New Roman" w:hAnsi="Times New Roman" w:eastAsia="Times New Roman"/>
-          <w:sz w:val="28"/>
-        </w:rPr>
-        <w:t>Разработать параметрическую модель трехмерной проекционной поверхности типа bowl, в которой геометрия определяется размерами транспортного средства, положением и ориентацией камер, размерами рабочей области, высотой и кривизной перехода от плоской области к боковым областям поверхности.</w:t>
+        <w:t>Реализовать статическую дискретизацию по оценке ошибки проекции и экранной аппроксимации, ограничения ресурсов и сравнение с равномерными сетками.</w:t>
       </w:r>
     </w:p>
     <w:p>
       <w:pPr>
-        <w:pStyle w:val="ListNumber"/>
-        <w:spacing w:after="60" w:line="276" w:lineRule="auto"/>
-        <w:ind w:left="0" w:hanging="357"/>
+        <w:pStyle w:val="ListParagraph"/>
+        <w:jc w:val="left"/>
+        <w:spacing w:after="100" w:line="276" w:lineRule="auto"/>
+        <w:widowControl/>
+        <w:numPr>
+          <w:ilvl w:val="0"/>
+          <w:numId w:val="13"/>
+        </w:numPr>
+        <w:ind w:left="480" w:hanging="480"/>
       </w:pPr>
       <w:r>
-        <w:rPr>
-          <w:rFonts w:ascii="Times New Roman" w:hAnsi="Times New Roman" w:eastAsia="Times New Roman"/>
-          <w:sz w:val="28"/>
-        </w:rPr>
-        <w:t>Разработать механизм автоматического формирования вершинной сетки проекционной поверхности и параметров отображения камер на основе конфигурации транспортного средства и калибровочных данных.</w:t>
+        <w:t>Создать минимальный интерактивный стенд: отдельный сервер, Qt Quick (QML), локальный replay, лёгкий producer и диагностику неисправностей.</w:t>
       </w:r>
     </w:p>
     <w:p>
       <w:pPr>
-        <w:pStyle w:val="ListNumber"/>
-        <w:spacing w:after="60" w:line="276" w:lineRule="auto"/>
-        <w:ind w:left="0" w:hanging="357"/>
+        <w:pStyle w:val="ListParagraph"/>
+        <w:jc w:val="left"/>
+        <w:spacing w:after="100" w:line="276" w:lineRule="auto"/>
+        <w:widowControl/>
+        <w:numPr>
+          <w:ilvl w:val="0"/>
+          <w:numId w:val="13"/>
+        </w:numPr>
+        <w:ind w:left="480" w:hanging="480"/>
       </w:pPr>
       <w:r>
-        <w:rPr>
-          <w:rFonts w:ascii="Times New Roman" w:hAnsi="Times New Roman" w:eastAsia="Times New Roman"/>
-          <w:sz w:val="28"/>
-        </w:rPr>
-        <w:t>Реализовать обработку изображений широкоугольных камер с учетом их внутренних и внешних параметров и модели оптической дисторсии.</w:t>
-      </w:r>
-    </w:p>
-    <w:p>
-      <w:pPr>
-        <w:pStyle w:val="ListNumber"/>
-        <w:spacing w:after="60" w:line="276" w:lineRule="auto"/>
-        <w:ind w:left="0" w:hanging="357"/>
-      </w:pPr>
-      <w:r>
-        <w:rPr>
-          <w:rFonts w:ascii="Times New Roman" w:hAnsi="Times New Roman" w:eastAsia="Times New Roman"/>
-          <w:sz w:val="28"/>
-        </w:rPr>
-        <w:t>Реализовать проецирование изображений нескольких камер на общую трехмерную поверхность и обработку областей перекрытия камер с использованием весового смешивания.</w:t>
-      </w:r>
-    </w:p>
-    <w:p>
-      <w:pPr>
-        <w:pStyle w:val="ListNumber"/>
-        <w:spacing w:after="60" w:line="276" w:lineRule="auto"/>
-        <w:ind w:left="0" w:hanging="357"/>
-      </w:pPr>
-      <w:r>
-        <w:rPr>
-          <w:rFonts w:ascii="Times New Roman" w:hAnsi="Times New Roman" w:eastAsia="Times New Roman"/>
-          <w:sz w:val="28"/>
-        </w:rPr>
-        <w:t>Разработать GPU-ориентированный графический конвейер, в котором вычисление координат выборки, коррекция дисторсии, смешивание и формирование итогового изображения по возможности выполняются без промежуточного возврата данных на CPU.</w:t>
-      </w:r>
-    </w:p>
-    <w:p>
-      <w:pPr>
-        <w:pStyle w:val="ListNumber"/>
-        <w:spacing w:after="60" w:line="276" w:lineRule="auto"/>
-        <w:ind w:left="0" w:hanging="357"/>
-      </w:pPr>
-      <w:r>
-        <w:rPr>
-          <w:rFonts w:ascii="Times New Roman" w:hAnsi="Times New Roman" w:eastAsia="Times New Roman"/>
-          <w:sz w:val="28"/>
-        </w:rPr>
-        <w:t>Разработать интерактивное трехмерное представление, позволяющее свободно изменять положение виртуального наблюдателя, использовать фиксированные автомобильные ракурсы и получать различные виды одной сформированной трехмерной сцены без повторной обработки исходных видеоданных.</w:t>
-      </w:r>
-    </w:p>
-    <w:p>
-      <w:pPr>
-        <w:pStyle w:val="ListNumber"/>
-        <w:spacing w:after="60" w:line="276" w:lineRule="auto"/>
-        <w:ind w:left="0" w:hanging="357"/>
-      </w:pPr>
-      <w:r>
-        <w:rPr>
-          <w:rFonts w:ascii="Times New Roman" w:hAnsi="Times New Roman" w:eastAsia="Times New Roman"/>
-          <w:sz w:val="28"/>
-        </w:rPr>
-        <w:t>Обеспечить конфигурируемость подсистемы: изменение параметров автомобиля, калибровки камер и геометрии проекционной поверхности должно выполняться без изменения основного алгоритмического конвейера.</w:t>
-      </w:r>
-    </w:p>
-    <w:p>
-      <w:pPr>
-        <w:pStyle w:val="ListNumber"/>
-        <w:spacing w:after="60" w:line="276" w:lineRule="auto"/>
-        <w:ind w:left="0" w:hanging="357"/>
-      </w:pPr>
-      <w:r>
-        <w:rPr>
-          <w:rFonts w:ascii="Times New Roman" w:hAnsi="Times New Roman" w:eastAsia="Times New Roman"/>
-          <w:sz w:val="28"/>
-        </w:rPr>
-        <w:t>Реализовать средства измерения времени отдельных стадий обработки, времени кадра, загрузки CPU/GPU и использования памяти для анализа производительности системы.</w:t>
-      </w:r>
-    </w:p>
-    <w:p>
-      <w:pPr>
-        <w:pStyle w:val="ListNumber"/>
-        <w:spacing w:after="60" w:line="276" w:lineRule="auto"/>
-        <w:ind w:left="0" w:hanging="357"/>
-      </w:pPr>
-      <w:r>
-        <w:rPr>
-          <w:rFonts w:ascii="Times New Roman" w:hAnsi="Times New Roman" w:eastAsia="Times New Roman"/>
-          <w:sz w:val="28"/>
-        </w:rPr>
-        <w:t>Провести экспериментальную проверку подсистемы на различных конфигурациях проекционной сетки, разрешениях входных потоков и положениях виртуальной камеры и подтвердить возможность работы в режиме реального времени.</w:t>
-      </w:r>
-    </w:p>
-    <w:p>
-      <w:pPr>
-        <w:pStyle w:val="ListNumber"/>
-        <w:spacing w:after="60" w:line="276" w:lineRule="auto"/>
-        <w:ind w:left="0" w:hanging="357"/>
-      </w:pPr>
-      <w:r>
-        <w:rPr>
-          <w:rFonts w:ascii="Times New Roman" w:hAnsi="Times New Roman" w:eastAsia="Times New Roman"/>
-          <w:sz w:val="28"/>
-        </w:rPr>
-        <w:t>Интегрировать программную подсистему в целевую автомобильную программную экосистему либо разработать совместимый интеграционный слой, позволяющий использовать ее как самостоятельный программный модуль.</w:t>
+        <w:t>Провести воспроизводимые сравнительные эксперименты, оценить точность, стоимость, отклик и ограничения; сформулировать выводы по гипотезе.</w:t>
       </w:r>
     </w:p>
     <w:p>
       <w:pPr>
         <w:pStyle w:val="Heading1"/>
+        <w:jc w:val="left"/>
+        <w:spacing w:after="100" w:line="276" w:lineRule="auto"/>
+        <w:widowControl/>
         <w:keepNext/>
-        <w:spacing w:before="240" w:after="120"/>
       </w:pPr>
       <w:r>
-        <w:t>6. Предполагаемая научная новизна</w:t>
+        <w:t>6. Планируемый вклад и практическая значимость</w:t>
       </w:r>
     </w:p>
     <w:p>
       <w:pPr>
-        <w:spacing w:line="360" w:lineRule="auto" w:after="60"/>
-        <w:ind w:firstLine="709"/>
-        <w:jc w:val="both"/>
+        <w:jc w:val="left"/>
+        <w:spacing w:after="100" w:line="276" w:lineRule="auto"/>
+        <w:widowControl/>
       </w:pPr>
       <w:r>
-        <w:rPr>
-          <w:rFonts w:ascii="Times New Roman" w:hAnsi="Times New Roman" w:eastAsia="Times New Roman"/>
-          <w:sz w:val="28"/>
-        </w:rPr>
-        <w:t>Научная новизна работы предполагается преимущественно архитектурно-программной и прикладной. Работа не ставит целью создание принципиально нового класса алгоритмов Surround View. Новизна должна заключаться в способе организации и конфигурирования подсистемы для конкретной автомобильной программной среды, а окончательные формулировки необходимо уточнить после анализа ближайших аналогов.</w:t>
+        <w:t>Предполагаемый вклад — методика выбора дискретизации по заданному пределу ошибки проекции, её реализация и экспериментальная оценка относительно равномерной сетки. Адаптивная дискретизация известна в компьютерной графике. Формулировка о собственном методе остаётся предварительной до обзора близких работ по Surround View и установления отличий критерия, ограничений либо процедуры.</w:t>
       </w:r>
     </w:p>
     <w:p>
       <w:pPr>
-        <w:pStyle w:val="ListNumber"/>
-        <w:spacing w:after="60" w:line="276" w:lineRule="auto"/>
-        <w:ind w:left="0" w:hanging="357"/>
+        <w:jc w:val="left"/>
+        <w:spacing w:after="100" w:line="276" w:lineRule="auto"/>
+        <w:widowControl/>
       </w:pPr>
       <w:r>
-        <w:rPr>
-          <w:rFonts w:ascii="Times New Roman" w:hAnsi="Times New Roman" w:eastAsia="Times New Roman"/>
-          <w:sz w:val="28"/>
-        </w:rPr>
-        <w:t>Разработан способ параметрического формирования трехмерной проекционной поверхности системы кругового обзора, позволяющий автоматически получать проекционную сетку по геометрическим параметрам транспортного средства, пространственному расположению камер и их калибровочным характеристикам.</w:t>
+        <w:t>Если отличия не подтверждаются, работа оформляется как сравнительное исследование и инженерная реализация с количественными выводами. Формулировки о разработанных и доказанных улучшениях применяются только после получения результатов.</w:t>
       </w:r>
     </w:p>
     <w:p>
       <w:pPr>
-        <w:pStyle w:val="ListNumber"/>
-        <w:spacing w:after="60" w:line="276" w:lineRule="auto"/>
-        <w:ind w:left="0" w:hanging="357"/>
+        <w:jc w:val="left"/>
+        <w:spacing w:after="100" w:line="276" w:lineRule="auto"/>
+        <w:widowControl/>
       </w:pPr>
       <w:r>
-        <w:rPr>
-          <w:rFonts w:ascii="Times New Roman" w:hAnsi="Times New Roman" w:eastAsia="Times New Roman"/>
-          <w:sz w:val="28"/>
-        </w:rPr>
-        <w:t>Разработана архитектура GPU-ориентированного конвейера формирования трехмерного кругового обзора, в которой единая модель проекционной поверхности используется для коррекции оптических искажений, вычисления текстурных координат, смешивания многокамерных изображений и дальнейшей интерактивной визуализации.</w:t>
-      </w:r>
-    </w:p>
-    <w:p>
-      <w:pPr>
-        <w:pStyle w:val="ListNumber"/>
-        <w:spacing w:after="60" w:line="276" w:lineRule="auto"/>
-        <w:ind w:left="0" w:hanging="357"/>
-      </w:pPr>
-      <w:r>
-        <w:rPr>
-          <w:rFonts w:ascii="Times New Roman" w:hAnsi="Times New Roman" w:eastAsia="Times New Roman"/>
-          <w:sz w:val="28"/>
-        </w:rPr>
-        <w:t>Разработан способ конфигурирования подсистемы, обеспечивающий перенос между различными геометрическими конфигурациями транспортного средства и камер без изменения основной структуры алгоритмов обработки и рендеринга.</w:t>
-      </w:r>
-    </w:p>
-    <w:p>
-      <w:pPr>
-        <w:pStyle w:val="ListNumber"/>
-        <w:spacing w:after="60" w:line="276" w:lineRule="auto"/>
-        <w:ind w:left="0" w:hanging="357"/>
-      </w:pPr>
-      <w:r>
-        <w:rPr>
-          <w:rFonts w:ascii="Times New Roman" w:hAnsi="Times New Roman" w:eastAsia="Times New Roman"/>
-          <w:sz w:val="28"/>
-        </w:rPr>
-        <w:t>Сформирован программный подход к интерактивному представлению результата как единой трехмерной сцены, позволяющий получать различные ракурсы виртуальной камеры из одной сформированной проекционной модели без предварительного расчета отдельных двумерных представлений.</w:t>
-      </w:r>
-    </w:p>
-    <w:p>
-      <w:pPr>
-        <w:spacing w:line="360" w:lineRule="auto" w:before="120" w:after="120"/>
-      </w:pPr>
-      <w:r>
-        <w:rPr>
-          <w:rFonts w:ascii="Times New Roman" w:hAnsi="Times New Roman" w:eastAsia="Times New Roman"/>
-          <w:b/>
-          <w:sz w:val="28"/>
-        </w:rPr>
-        <w:t xml:space="preserve">Примечание. </w:t>
-      </w:r>
-      <w:r>
-        <w:rPr>
-          <w:rFonts w:ascii="Times New Roman" w:hAnsi="Times New Roman" w:eastAsia="Times New Roman"/>
-          <w:sz w:val="28"/>
-        </w:rPr>
-        <w:t>Перед утверждением окончательной формулировки научной новизны необходимо выполнить обзор научных публикаций, патентов и существующих программных архитектур. По результатам обзора формулировки должны быть сужены до тех свойств, которые действительно отличают разработанную подсистему от ближайших аналогов.</w:t>
+        <w:t>Практическая значимость — общее программное ядро, воспроизводимые наборы экспериментов, конфигурации нескольких камерных установок и интеграция с интерфейсом отображения. Один бинарный файл должен обрабатывать минимум три конфигурации автомобиля/камер без изменения исходного кода.</w:t>
       </w:r>
     </w:p>
     <w:p>
       <w:pPr>
         <w:pStyle w:val="Heading1"/>
+        <w:jc w:val="left"/>
+        <w:spacing w:after="100" w:line="276" w:lineRule="auto"/>
+        <w:widowControl/>
         <w:keepNext/>
-        <w:spacing w:before="240" w:after="120"/>
       </w:pPr>
       <w:r>
-        <w:t>7. Основные отличительные свойства разрабатываемого продукта</w:t>
-      </w:r>
-    </w:p>
-    <w:tbl>
-      <w:tblPr>
-        <w:tblStyle w:val="TableGrid"/>
-        <w:tblW w:type="auto" w:w="0"/>
-        <w:jc w:val="center"/>
-        <w:tblLook w:firstColumn="1" w:firstRow="1" w:lastColumn="0" w:lastRow="0" w:noHBand="0" w:noVBand="1" w:val="04A0"/>
-      </w:tblPr>
-      <w:tblGrid>
-        <w:gridCol w:w="4844"/>
-        <w:gridCol w:w="4844"/>
-      </w:tblGrid>
-      <w:tr>
-        <w:tc>
-          <w:tcPr>
-            <w:tcW w:type="dxa" w:w="4844"/>
-            <w:shd w:fill="D9EAF7"/>
-            <w:vAlign w:val="center"/>
-            <w:tcMar>
-              <w:top w:w="80" w:type="dxa"/>
-              <w:start w:w="100" w:type="dxa"/>
-              <w:bottom w:w="80" w:type="dxa"/>
-              <w:end w:w="100" w:type="dxa"/>
-            </w:tcMar>
-          </w:tcPr>
-          <w:p>
-            <w:pPr>
-              <w:jc w:val="center"/>
-            </w:pPr>
-            <w:r>
-              <w:rPr>
-                <w:rFonts w:ascii="Times New Roman" w:hAnsi="Times New Roman" w:eastAsia="Times New Roman"/>
-                <w:b/>
-                <w:sz w:val="24"/>
-              </w:rPr>
-              <w:t>Свойство</w:t>
-            </w:r>
-          </w:p>
-        </w:tc>
-        <w:tc>
-          <w:tcPr>
-            <w:tcW w:type="dxa" w:w="4844"/>
-            <w:shd w:fill="D9EAF7"/>
-            <w:vAlign w:val="center"/>
-            <w:tcMar>
-              <w:top w:w="80" w:type="dxa"/>
-              <w:start w:w="100" w:type="dxa"/>
-              <w:bottom w:w="80" w:type="dxa"/>
-              <w:end w:w="100" w:type="dxa"/>
-            </w:tcMar>
-          </w:tcPr>
-          <w:p>
-            <w:pPr>
-              <w:jc w:val="center"/>
-            </w:pPr>
-            <w:r>
-              <w:rPr>
-                <w:rFonts w:ascii="Times New Roman" w:hAnsi="Times New Roman" w:eastAsia="Times New Roman"/>
-                <w:b/>
-                <w:sz w:val="24"/>
-              </w:rPr>
-              <w:t>Содержание</w:t>
-            </w:r>
-          </w:p>
-        </w:tc>
-      </w:tr>
-      <w:tr>
-        <w:tc>
-          <w:tcPr>
-            <w:tcW w:type="dxa" w:w="4844"/>
-            <w:tcMar>
-              <w:top w:w="80" w:type="dxa"/>
-              <w:start w:w="100" w:type="dxa"/>
-              <w:bottom w:w="80" w:type="dxa"/>
-              <w:end w:w="100" w:type="dxa"/>
-            </w:tcMar>
-            <w:vAlign w:val="center"/>
-          </w:tcPr>
-          <w:p>
-            <w:r>
-              <w:rPr>
-                <w:rFonts w:ascii="Times New Roman" w:hAnsi="Times New Roman" w:eastAsia="Times New Roman"/>
-                <w:b/>
-                <w:sz w:val="24"/>
-              </w:rPr>
-              <w:t>Параметрическая проекционная поверхность</w:t>
-            </w:r>
-          </w:p>
-        </w:tc>
-        <w:tc>
-          <w:tcPr>
-            <w:tcW w:type="dxa" w:w="4844"/>
-            <w:tcMar>
-              <w:top w:w="80" w:type="dxa"/>
-              <w:start w:w="100" w:type="dxa"/>
-              <w:bottom w:w="80" w:type="dxa"/>
-              <w:end w:w="100" w:type="dxa"/>
-            </w:tcMar>
-            <w:vAlign w:val="center"/>
-          </w:tcPr>
-          <w:p>
-            <w:r>
-              <w:rPr>
-                <w:rFonts w:ascii="Times New Roman" w:hAnsi="Times New Roman" w:eastAsia="Times New Roman"/>
-                <w:sz w:val="24"/>
-              </w:rPr>
-              <w:t>Геометрия bowl-поверхности не задается вручную как единственная модель для конкретного автомобиля. Она формируется из конфигурационных параметров автомобиля и многокамерной системы.</w:t>
-            </w:r>
-          </w:p>
-        </w:tc>
-      </w:tr>
-      <w:tr>
-        <w:tc>
-          <w:tcPr>
-            <w:tcW w:type="dxa" w:w="4844"/>
-            <w:tcMar>
-              <w:top w:w="80" w:type="dxa"/>
-              <w:start w:w="100" w:type="dxa"/>
-              <w:bottom w:w="80" w:type="dxa"/>
-              <w:end w:w="100" w:type="dxa"/>
-            </w:tcMar>
-            <w:vAlign w:val="center"/>
-          </w:tcPr>
-          <w:p>
-            <w:r>
-              <w:rPr>
-                <w:rFonts w:ascii="Times New Roman" w:hAnsi="Times New Roman" w:eastAsia="Times New Roman"/>
-                <w:b/>
-                <w:sz w:val="24"/>
-              </w:rPr>
-              <w:t>GPU-ориентированный конвейер</w:t>
-            </w:r>
-          </w:p>
-        </w:tc>
-        <w:tc>
-          <w:tcPr>
-            <w:tcW w:type="dxa" w:w="4844"/>
-            <w:tcMar>
-              <w:top w:w="80" w:type="dxa"/>
-              <w:start w:w="100" w:type="dxa"/>
-              <w:bottom w:w="80" w:type="dxa"/>
-              <w:end w:w="100" w:type="dxa"/>
-            </w:tcMar>
-            <w:vAlign w:val="center"/>
-          </w:tcPr>
-          <w:p>
-            <w:r>
-              <w:rPr>
-                <w:rFonts w:ascii="Times New Roman" w:hAnsi="Times New Roman" w:eastAsia="Times New Roman"/>
-                <w:sz w:val="24"/>
-              </w:rPr>
-              <w:t>Обработка проектируется с расчетом на выполнение основных операций на GPU и минимизацию промежуточных копирований между CPU и GPU.</w:t>
-            </w:r>
-          </w:p>
-        </w:tc>
-      </w:tr>
-      <w:tr>
-        <w:tc>
-          <w:tcPr>
-            <w:tcW w:type="dxa" w:w="4844"/>
-            <w:tcMar>
-              <w:top w:w="80" w:type="dxa"/>
-              <w:start w:w="100" w:type="dxa"/>
-              <w:bottom w:w="80" w:type="dxa"/>
-              <w:end w:w="100" w:type="dxa"/>
-            </w:tcMar>
-            <w:vAlign w:val="center"/>
-          </w:tcPr>
-          <w:p>
-            <w:r>
-              <w:rPr>
-                <w:rFonts w:ascii="Times New Roman" w:hAnsi="Times New Roman" w:eastAsia="Times New Roman"/>
-                <w:b/>
-                <w:sz w:val="24"/>
-              </w:rPr>
-              <w:t>Интерактивное 3D-представление</w:t>
-            </w:r>
-          </w:p>
-        </w:tc>
-        <w:tc>
-          <w:tcPr>
-            <w:tcW w:type="dxa" w:w="4844"/>
-            <w:tcMar>
-              <w:top w:w="80" w:type="dxa"/>
-              <w:start w:w="100" w:type="dxa"/>
-              <w:bottom w:w="80" w:type="dxa"/>
-              <w:end w:w="100" w:type="dxa"/>
-            </w:tcMar>
-            <w:vAlign w:val="center"/>
-          </w:tcPr>
-          <w:p>
-            <w:r>
-              <w:rPr>
-                <w:rFonts w:ascii="Times New Roman" w:hAnsi="Times New Roman" w:eastAsia="Times New Roman"/>
-                <w:sz w:val="24"/>
-              </w:rPr>
-              <w:t>Результатом является не только bird’s-eye кадр, а трехмерная сцена, которую можно наблюдать из различных положений виртуальной камеры.</w:t>
-            </w:r>
-          </w:p>
-        </w:tc>
-      </w:tr>
-      <w:tr>
-        <w:tc>
-          <w:tcPr>
-            <w:tcW w:type="dxa" w:w="4844"/>
-            <w:tcMar>
-              <w:top w:w="80" w:type="dxa"/>
-              <w:start w:w="100" w:type="dxa"/>
-              <w:bottom w:w="80" w:type="dxa"/>
-              <w:end w:w="100" w:type="dxa"/>
-            </w:tcMar>
-            <w:vAlign w:val="center"/>
-          </w:tcPr>
-          <w:p>
-            <w:r>
-              <w:rPr>
-                <w:rFonts w:ascii="Times New Roman" w:hAnsi="Times New Roman" w:eastAsia="Times New Roman"/>
-                <w:b/>
-                <w:sz w:val="24"/>
-              </w:rPr>
-              <w:t>Конфигурируемость и переносимость</w:t>
-            </w:r>
-          </w:p>
-        </w:tc>
-        <w:tc>
-          <w:tcPr>
-            <w:tcW w:type="dxa" w:w="4844"/>
-            <w:tcMar>
-              <w:top w:w="80" w:type="dxa"/>
-              <w:start w:w="100" w:type="dxa"/>
-              <w:bottom w:w="80" w:type="dxa"/>
-              <w:end w:w="100" w:type="dxa"/>
-            </w:tcMar>
-            <w:vAlign w:val="center"/>
-          </w:tcPr>
-          <w:p>
-            <w:r>
-              <w:rPr>
-                <w:rFonts w:ascii="Times New Roman" w:hAnsi="Times New Roman" w:eastAsia="Times New Roman"/>
-                <w:sz w:val="24"/>
-              </w:rPr>
-              <w:t>Одна программная архитектура должна поддерживать различные размеры автомобиля и варианты размещения камер через изменение параметров конфигурации.</w:t>
-            </w:r>
-          </w:p>
-        </w:tc>
-      </w:tr>
-      <w:tr>
-        <w:tc>
-          <w:tcPr>
-            <w:tcW w:type="dxa" w:w="4844"/>
-            <w:tcMar>
-              <w:top w:w="80" w:type="dxa"/>
-              <w:start w:w="100" w:type="dxa"/>
-              <w:bottom w:w="80" w:type="dxa"/>
-              <w:end w:w="100" w:type="dxa"/>
-            </w:tcMar>
-            <w:vAlign w:val="center"/>
-          </w:tcPr>
-          <w:p>
-            <w:r>
-              <w:rPr>
-                <w:rFonts w:ascii="Times New Roman" w:hAnsi="Times New Roman" w:eastAsia="Times New Roman"/>
-                <w:b/>
-                <w:sz w:val="24"/>
-              </w:rPr>
-              <w:t>Интеграционная пригодность</w:t>
-            </w:r>
-          </w:p>
-        </w:tc>
-        <w:tc>
-          <w:tcPr>
-            <w:tcW w:type="dxa" w:w="4844"/>
-            <w:tcMar>
-              <w:top w:w="80" w:type="dxa"/>
-              <w:start w:w="100" w:type="dxa"/>
-              <w:bottom w:w="80" w:type="dxa"/>
-              <w:end w:w="100" w:type="dxa"/>
-            </w:tcMar>
-            <w:vAlign w:val="center"/>
-          </w:tcPr>
-          <w:p>
-            <w:r>
-              <w:rPr>
-                <w:rFonts w:ascii="Times New Roman" w:hAnsi="Times New Roman" w:eastAsia="Times New Roman"/>
-                <w:sz w:val="24"/>
-              </w:rPr>
-              <w:t>Подсистема проектируется как модуль автомобильной программной экосистемы, а не как изолированное демонстрационное приложение.</w:t>
-            </w:r>
-          </w:p>
-        </w:tc>
-      </w:tr>
-    </w:tbl>
-    <w:p>
-      <w:pPr>
-        <w:pStyle w:val="Heading1"/>
-        <w:keepNext/>
-        <w:spacing w:before="240" w:after="120"/>
-      </w:pPr>
-      <w:r>
-        <w:t>8. Функциональная схема подсистемы</w:t>
+        <w:t>7. Математическая модель и исследуемый способ</w:t>
       </w:r>
     </w:p>
     <w:p>
       <w:pPr>
-        <w:spacing w:line="360" w:lineRule="auto" w:after="60"/>
-        <w:ind w:firstLine="709"/>
-        <w:jc w:val="both"/>
+        <w:jc w:val="left"/>
+        <w:spacing w:after="100" w:line="276" w:lineRule="auto"/>
+        <w:widowControl/>
       </w:pPr>
       <w:r>
-        <w:rPr>
-          <w:rFonts w:ascii="Times New Roman" w:hAnsi="Times New Roman" w:eastAsia="Times New Roman"/>
-          <w:sz w:val="28"/>
-        </w:rPr>
-        <w:t>На верхнем уровне работа подсистемы может быть представлена следующей последовательностью обработки:</w:t>
+        <w:t>Система автомобиля правая: X вперёд, Y влево, Z вверх, начало в центре следа автомобиля на земле. Система физической камеры: X вправо, Y вниз, Z вдоль оптической оси. Используются метры, радианы и векторы-столбцы. Матрица T_camera_from_vehicle однозначно переводит точку автомобиля в камеру. Полные формулы и порядок преобразований зафиксированы в COORDINATE_SYSTEMS.md.</w:t>
       </w:r>
     </w:p>
     <w:p>
       <w:pPr>
-        <w:pStyle w:val="ListNumber"/>
-        <w:spacing w:after="60" w:line="276" w:lineRule="auto"/>
-        <w:ind w:left="0" w:hanging="357"/>
+        <w:jc w:val="left"/>
+        <w:spacing w:after="100" w:line="276" w:lineRule="auto"/>
+        <w:widowControl/>
       </w:pPr>
       <w:r>
-        <w:rPr>
-          <w:rFonts w:ascii="Times New Roman" w:hAnsi="Times New Roman" w:eastAsia="Times New Roman"/>
-          <w:sz w:val="28"/>
-        </w:rPr>
-        <w:t>Получение четырех синхронизированных или воспроизводимых видеопотоков и соответствующих калибровочных параметров.</w:t>
+        <w:t>Выбрана модель opencv_fisheye с fx, fy, cx, cy, k1–k4 и нулевым skew [3]. MVP ограничивает используемые направления передней полусферой с углом меньше π/2. Разрешение калибровки, правила resize/crop и маски валидности задаются явно. Калибровка является входным условием: требуются происхождение, остаточная ошибка и независимые проверочные наблюдения; универсальный калибровщик не входит в объём.</w:t>
       </w:r>
     </w:p>
     <w:p>
       <w:pPr>
-        <w:pStyle w:val="ListNumber"/>
-        <w:spacing w:after="60" w:line="276" w:lineRule="auto"/>
-        <w:ind w:left="0" w:hanging="357"/>
+        <w:jc w:val="left"/>
+        <w:spacing w:after="100" w:line="276" w:lineRule="auto"/>
+        <w:widowControl/>
       </w:pPr>
       <w:r>
-        <w:rPr>
-          <w:rFonts w:ascii="Times New Roman" w:hAnsi="Times New Roman" w:eastAsia="Times New Roman"/>
-          <w:sz w:val="28"/>
-        </w:rPr>
-        <w:t>Формирование параметрической bowl-поверхности по конфигурации транспортного средства.</w:t>
+        <w:t>Исходная bowl — поверхность S(u,v)=(u,v,H·(dx²+dy²)/2), где dx=max(|u|−a,0)/(A−a), dy=max(|v|−b,0)/(B−b), u∈[−A,A], v∈[−B,B], A&gt;a&gt;0, B&gt;b&gt;0 и H≥0. В центре поверхность плоская, переход непрерывен с непрерывной первой производной; H задаёт высоту углов. Габариты автомобиля определяют маску и допустимую плоскую область. Камеры определяют отображения, покрытие и критерий сетки, но не автоматически меняют аналитическую форму.</w:t>
       </w:r>
     </w:p>
     <w:p>
       <w:pPr>
-        <w:pStyle w:val="ListNumber"/>
-        <w:spacing w:after="60" w:line="276" w:lineRule="auto"/>
-        <w:ind w:left="0" w:hanging="357"/>
+        <w:jc w:val="left"/>
+        <w:spacing w:after="100" w:line="276" w:lineRule="auto"/>
+        <w:widowControl/>
       </w:pPr>
       <w:r>
-        <w:rPr>
-          <w:rFonts w:ascii="Times New Roman" w:hAnsi="Times New Roman" w:eastAsia="Times New Roman"/>
-          <w:sz w:val="28"/>
-        </w:rPr>
-        <w:t>Определение соответствия между точками проекционной поверхности и координатами изображений физических камер.</w:t>
+        <w:t>Для ячеек сетки сравниваются точные проекции промежуточных точек аналитической поверхности и интерполированные UV; дополнительно оценивается экранная ошибка на заданных виртуальных ракурсах. Превышение допуска вызывает согласованное подразделение без трещин и T-стыков. Переходы валидности обрабатываются отдельно. Глубина и число треугольников ограничены; при несовместимых бюджетах выдаётся диагностируемое нарушение. Проверка конечного числа проб не является доказательством глобальной верхней границы ошибки.</w:t>
       </w:r>
     </w:p>
     <w:p>
       <w:pPr>
-        <w:pStyle w:val="ListNumber"/>
-        <w:spacing w:after="60" w:line="276" w:lineRule="auto"/>
-        <w:ind w:left="0" w:hanging="357"/>
+        <w:jc w:val="left"/>
+        <w:spacing w:after="100" w:line="276" w:lineRule="auto"/>
+        <w:widowControl/>
       </w:pPr>
       <w:r>
-        <w:rPr>
-          <w:rFonts w:ascii="Times New Roman" w:hAnsi="Times New Roman" w:eastAsia="Times New Roman"/>
-          <w:sz w:val="28"/>
-        </w:rPr>
-        <w:t>Выборка и коррекция изображений широкоугольных камер средствами GPU.</w:t>
-      </w:r>
-    </w:p>
-    <w:p>
-      <w:pPr>
-        <w:pStyle w:val="ListNumber"/>
-        <w:spacing w:after="60" w:line="276" w:lineRule="auto"/>
-        <w:ind w:left="0" w:hanging="357"/>
-      </w:pPr>
-      <w:r>
-        <w:rPr>
-          <w:rFonts w:ascii="Times New Roman" w:hAnsi="Times New Roman" w:eastAsia="Times New Roman"/>
-          <w:sz w:val="28"/>
-        </w:rPr>
-        <w:t>Смешивание камер в областях перекрытия и формирование единой текстурированной трехмерной поверхности.</w:t>
-      </w:r>
-    </w:p>
-    <w:p>
-      <w:pPr>
-        <w:pStyle w:val="ListNumber"/>
-        <w:spacing w:after="60" w:line="276" w:lineRule="auto"/>
-        <w:ind w:left="0" w:hanging="357"/>
-      </w:pPr>
-      <w:r>
-        <w:rPr>
-          <w:rFonts w:ascii="Times New Roman" w:hAnsi="Times New Roman" w:eastAsia="Times New Roman"/>
-          <w:sz w:val="28"/>
-        </w:rPr>
-        <w:t>Визуализация сформированной сцены с использованием виртуальной камеры и предустановленных ракурсов.</w:t>
-      </w:r>
-    </w:p>
-    <w:p>
-      <w:pPr>
-        <w:pStyle w:val="ListNumber"/>
-        <w:spacing w:after="60" w:line="276" w:lineRule="auto"/>
-        <w:ind w:left="0" w:hanging="357"/>
-      </w:pPr>
-      <w:r>
-        <w:rPr>
-          <w:rFonts w:ascii="Times New Roman" w:hAnsi="Times New Roman" w:eastAsia="Times New Roman"/>
-          <w:sz w:val="28"/>
-        </w:rPr>
-        <w:t>Передача результата в графический интерфейс целевой автомобильной платформы.</w:t>
+        <w:t>В смешивание входят только валидные и доступные камеры. При положительной сумме весов они нормируются; при сумме ниже epsilon формируется маска «нет данных». После отказа камеры оставшиеся веса перенормируются. Покрытие заранее выбранной ROI и фотометрический шов измеряются отдельно; отсутствие дыр и швов при любом размещении камер не обещается.</w:t>
       </w:r>
     </w:p>
     <w:p>
       <w:pPr>
         <w:pStyle w:val="Heading1"/>
+        <w:jc w:val="left"/>
+        <w:spacing w:after="100" w:line="276" w:lineRule="auto"/>
+        <w:widowControl/>
         <w:keepNext/>
-        <w:spacing w:before="240" w:after="120"/>
       </w:pPr>
       <w:r>
-        <w:t>9. Ожидаемый практический результат</w:t>
+        <w:t>8. Архитектура и интерактивность</w:t>
       </w:r>
     </w:p>
     <w:p>
       <w:pPr>
-        <w:spacing w:line="360" w:lineRule="auto" w:after="60"/>
-        <w:ind w:firstLine="709"/>
-        <w:jc w:val="both"/>
+        <w:jc w:val="left"/>
+        <w:spacing w:after="100" w:line="276" w:lineRule="auto"/>
+        <w:widowControl/>
       </w:pPr>
       <w:r>
-        <w:rPr>
-          <w:rFonts w:ascii="Times New Roman" w:hAnsi="Times New Roman" w:eastAsia="Times New Roman"/>
-          <w:sz w:val="28"/>
-        </w:rPr>
-        <w:t>Результатом работы должен стать законченный программный прототип на C++ под Linux с использованием OpenGL и/или Vulkan, способный в режиме реального времени формировать интерактивное трехмерное представление окружающего пространства автомобиля по данным нескольких fisheye-камер. Подсистема должна принимать конфигурацию транспортного средства и камер, автоматически формировать проекционную геометрию, выполнять основные этапы обработки средствами GPU и предоставлять результат для отображения внутри автомобильной программной платформы.</w:t>
+        <w:t>Принятый стек: C++20, Linux, CMake; исходный профиль OpenGL 3.3 Core/GLSL 330 через EGL; Qt 5.15, Qt Quick (QML) и Qt Quick Controls 2 для интерфейса [4]. Поддержка конкретного GPU и headless backend проверяется в начале работы. Если аппаратура требует OpenGL ES, до GPU-реализации фиксируется один новый профиль через ADR; параллельное освоение нескольких API не входит в обязательный объём.</w:t>
       </w:r>
     </w:p>
     <w:p>
       <w:pPr>
-        <w:spacing w:line="360" w:lineRule="auto" w:after="60"/>
-        <w:ind w:firstLine="709"/>
-        <w:jc w:val="both"/>
+        <w:jc w:val="left"/>
+        <w:spacing w:after="100" w:line="276" w:lineRule="auto"/>
+        <w:widowControl/>
       </w:pPr>
       <w:r>
-        <w:rPr>
-          <w:rFonts w:ascii="Times New Roman" w:hAnsi="Times New Roman" w:eastAsia="Times New Roman"/>
-          <w:sz w:val="28"/>
-        </w:rPr>
-        <w:t>Минимально достаточным результатом для завершенной магистерской работы является стабильная работа четырехкамерного Surround View с параметрической bowl-поверхностью, смешиванием камер, интерактивной виртуальной камерой, измерением производительности и подтвержденной возможностью интеграции. Более сложные возможности — адаптивная геометрия поверхности, динамический seam selection, реконструкция скрытых областей, depth estimation — целесообразно рассматривать только как возможные расширения при наличии временного резерва.</w:t>
+        <w:t>Библиотека sv-core не зависит от Qt и транспорта. Она содержит математические модели, геометрию, отображения и renderer. sv-server размещает ядро в отдельном процессе, владеет наборами кадров и виртуальной камерой. sv-bench запускает то же ядро на локальных данных. sv-ui отображает готовое изображение через Qt Quick scene graph, передаёт жесты и пишет собственные события. sv-simulator в обязательной версии подаёт известные данные и неисправности.</w:t>
+      </w:r>
+    </w:p>
+    <w:p>
+      <w:pPr>
+        <w:pStyle w:val="ListParagraph"/>
+        <w:jc w:val="left"/>
+        <w:spacing w:after="100" w:line="276" w:lineRule="auto"/>
+        <w:widowControl/>
+        <w:numPr>
+          <w:ilvl w:val="0"/>
+          <w:numId w:val="14"/>
+        </w:numPr>
+        <w:ind w:left="480" w:hanging="480"/>
+      </w:pPr>
+      <w:r>
+        <w:t>При загрузке конфигурации проверить параметры, построить поверхность и сетку, подготовить UV, маски, веса и GPU-ресурсы.</w:t>
+      </w:r>
+    </w:p>
+    <w:p>
+      <w:pPr>
+        <w:pStyle w:val="ListParagraph"/>
+        <w:jc w:val="left"/>
+        <w:spacing w:after="100" w:line="276" w:lineRule="auto"/>
+        <w:widowControl/>
+        <w:numPr>
+          <w:ilvl w:val="0"/>
+          <w:numId w:val="14"/>
+        </w:numPr>
+        <w:ind w:left="480" w:hanging="480"/>
+      </w:pPr>
+      <w:r>
+        <w:t>Для нового набора подобрать кадры с известным возрастом и skew, загрузить изменившиеся входы и обновить маски доступности.</w:t>
+      </w:r>
+    </w:p>
+    <w:p>
+      <w:pPr>
+        <w:pStyle w:val="ListParagraph"/>
+        <w:jc w:val="left"/>
+        <w:spacing w:after="100" w:line="276" w:lineRule="auto"/>
+        <w:widowControl/>
+        <w:numPr>
+          <w:ilvl w:val="0"/>
+          <w:numId w:val="14"/>
+        </w:numPr>
+        <w:ind w:left="480" w:hanging="480"/>
+      </w:pPr>
+      <w:r>
+        <w:t>Выполнить на GPU выборку, смешивание и рисование поверхности с текущей виртуальной камерой в итоговый FBO.</w:t>
+      </w:r>
+    </w:p>
+    <w:p>
+      <w:pPr>
+        <w:pStyle w:val="ListParagraph"/>
+        <w:jc w:val="left"/>
+        <w:spacing w:after="100" w:line="276" w:lineRule="auto"/>
+        <w:widowControl/>
+        <w:numPr>
+          <w:ilvl w:val="0"/>
+          <w:numId w:val="14"/>
+        </w:numPr>
+        <w:ind w:left="480" w:hanging="480"/>
+      </w:pPr>
+      <w:r>
+        <w:t>Передать итоговый кадр через ограниченный выходной адаптер в Qt Quick (QML), сохранив frame_set_id, frame_id и state_revision.</w:t>
+      </w:r>
+    </w:p>
+    <w:p>
+      <w:pPr>
+        <w:pStyle w:val="ListParagraph"/>
+        <w:jc w:val="left"/>
+        <w:spacing w:after="100" w:line="276" w:lineRule="auto"/>
+        <w:widowControl/>
+        <w:numPr>
+          <w:ilvl w:val="0"/>
+          <w:numId w:val="14"/>
+        </w:numPr>
+        <w:ind w:left="480" w:hanging="480"/>
+      </w:pPr>
+      <w:r>
+        <w:t>При orbit/zoom/preset изменить серверное состояние, использовать прежние входные текстуры и геометрию, сформировать новый выходной вид и связать его с command_id.</w:t>
+      </w:r>
+    </w:p>
+    <w:p>
+      <w:pPr>
+        <w:jc w:val="left"/>
+        <w:spacing w:after="100" w:line="276" w:lineRule="auto"/>
+        <w:widowControl/>
+      </w:pPr>
+      <w:r>
+        <w:t>Таким образом, жест не требует повторного чтения, декодирования или upload неизменившихся входов, построения сетки и калибровки. Новый выходной кадр при этом рендерится GPU. Обязательны orbit, zoom и пресеты с ограничениями наклона/дистанции и запретом входа в автомобиль или под поверхность; pan относится к расширениям.</w:t>
+      </w:r>
+    </w:p>
+    <w:p>
+      <w:pPr>
+        <w:jc w:val="left"/>
+        <w:spacing w:after="100" w:line="276" w:lineRule="auto"/>
+        <w:widowControl/>
+      </w:pPr>
+      <w:r>
+        <w:t>Первый выходной адаптер допускает readback итогового FBO, копирование через локальный IPC и upload в UI. Внутренние GPU-проходы не требуют full-frame readback. Стоимость выхода измеряется отдельно и входит в сквозную задержку. Номер OpenGL-текстуры не является межпроцессным контрактом; DMA-BUF рассматривается только при измеренном ограничении.</w:t>
+      </w:r>
+    </w:p>
+    <w:p>
+      <w:pPr>
+        <w:jc w:val="left"/>
+        <w:spacing w:after="100" w:line="276" w:lineRule="auto"/>
+        <w:widowControl/>
+      </w:pPr>
+      <w:r>
+        <w:t>Основной профиль использует один Linux-узел и единый CLOCK_MONOTONIC. Монотонные часы разных компьютеров имеют разные начала [5]; распределённый опыт требует преобразования времени и оценки погрешности. Replay сохраняет время сценария и отображает его в текущую шкалу исполнения, включая паузу и шаг. Устаревшие live-входы исключаются, их потеря меняет покрытие и статус, а рендер и команды продолжаются.</w:t>
       </w:r>
     </w:p>
     <w:p>
       <w:pPr>
         <w:pStyle w:val="Heading1"/>
+        <w:jc w:val="left"/>
+        <w:spacing w:after="100" w:line="276" w:lineRule="auto"/>
+        <w:widowControl/>
         <w:keepNext/>
-        <w:spacing w:before="240" w:after="120"/>
       </w:pPr>
       <w:r>
-        <w:t>10. Границы работы</w:t>
+        <w:t>9. Экспериментальная оценка</w:t>
       </w:r>
     </w:p>
     <w:p>
       <w:pPr>
-        <w:spacing w:line="360" w:lineRule="auto" w:after="60"/>
-        <w:ind w:firstLine="709"/>
-        <w:jc w:val="both"/>
+        <w:jc w:val="left"/>
+        <w:spacing w:after="100" w:line="276" w:lineRule="auto"/>
+        <w:widowControl/>
+      </w:pPr>
+      <w:r>
+        <w:t>Сравниваются плоская поверхность, обычная bowl с равномерными сетками разных плотностей, та же bowl с исследуемой сеткой и плотная сетка либо прямая проекция как численный ориентир. Для главного сравнения совпадают изображения, форма, калибровка, blending, разрешения и GPU-проход. Отдельно исследуется влияние формы при достаточной точности дискретизации.</w:t>
+      </w:r>
+    </w:p>
+    <w:p>
+      <w:pPr>
+        <w:jc w:val="left"/>
+        <w:spacing w:after="100" w:line="276" w:lineRule="auto"/>
+        <w:widowControl/>
+      </w:pPr>
+      <w:r>
+        <w:t>Материалы: аналитические сцены с известными маркерами; сцены с вертикальными объектами, движением и перекрытиями; желательно одна независимая реальная калиброванная запись. Конфигурации и точки настройки отделяются от итоговой оценки. Для каждого набора сохраняются источник, условия использования, хэши, timestamps и происхождение калибровки. Если реальных данных нет, выводы о качестве ограничиваются синтетикой.</w:t>
+      </w:r>
+    </w:p>
+    <w:p>
+      <w:pPr>
+        <w:jc w:val="left"/>
+        <w:spacing w:after="100" w:line="276" w:lineRule="auto"/>
+        <w:widowControl/>
+      </w:pPr>
+      <w:r>
+        <w:t>E-MATH-01 проверяет математику; E-SURFACE-01 — влияние формы и ограничения модели; E-MESH-01 — ошибку, треугольники, память, подготовку и GPU-время; E-INTERACTIVE-01 — смену ракурса на замороженных и движущихся входах; E-PERF-01 — масштабирование и полный путь до UI; E-ROBUST-01 — неисправности и чувствительность. E-REAL-01 является желательным опытом переноса на запись. Подробные сценарии определены в RESEARCH_PLAN.md.</w:t>
+      </w:r>
+    </w:p>
+    <w:p>
+      <w:pPr>
+        <w:jc w:val="left"/>
+        <w:spacing w:after="100" w:line="276" w:lineRule="auto"/>
+        <w:widowControl/>
+      </w:pPr>
+      <w:r>
+        <w:t>Начальный профиль — локальный replay четырёх RGB8-потоков 1280×720 при 30 FPS, выход RGBA8 1280×720. CPU/GPU, ОС, драйвер, экран, сборка и сетка фиксируются в паспорте. Четыре несжатых входа такого формата требуют 331,776 МБ/с, или 2,654208 Гбит/с полезной полосы; для канала 1 Гбит/с нужен отдельный уменьшенный или сжатый профиль с учётом его стоимости.</w:t>
+      </w:r>
+    </w:p>
+    <w:p>
+      <w:pPr>
+        <w:jc w:val="left"/>
+        <w:spacing w:after="100" w:line="276" w:lineRule="auto"/>
+        <w:widowControl/>
+      </w:pPr>
+      <w:r>
+        <w:t>Предварительные цели: p99 ошибки прямой GPU-проекции относительно CPU ≤0,1 пикселя входа; p99 ошибки сетки ≤0,5 пикселя входа и экрана на отложенных видах; покрытие заранее заданной физически покрываемой ROI ≥99%; p95 GPU-рендера ≤20 мс; p95 программной сквозной задержки и отклика команды ≤100 мс; пропущенные ожидаемые наборы ≤1% в десятиминутном стабильном прогоне. Все числа — проектные предложения, уточняемые по раннему baseline до итоговых сравнений. Они не являются измеренными результатами или универсальными нормативами.</w:t>
+      </w:r>
+    </w:p>
+    <w:p>
+      <w:pPr>
+        <w:jc w:val="left"/>
+        <w:spacing w:after="100" w:line="276" w:lineRule="auto"/>
+        <w:widowControl/>
+      </w:pPr>
+      <w:r>
+        <w:t>На замороженном PAUSED-наборе выполняются 500 команд и проверяется неизменность счётчиков decode/upload входа/mesh rebuild. UI связывает фактически использованный frame_id и ревизию с событием передачи на представление, например frameSwapped [6]. Получение пакета, ACK и физическое появление пикселя различаются; без внешнего измерителя заявляется только программная задержка.</w:t>
+      </w:r>
+    </w:p>
+    <w:p>
+      <w:pPr>
+        <w:jc w:val="left"/>
+        <w:spacing w:after="100" w:line="276" w:lineRule="auto"/>
+        <w:widowControl/>
+      </w:pPr>
+      <w:r>
+        <w:t>Для sweep используются прогрев 60 с и не менее трёх независимых прогонов по 180 с; выбранный эталонный режим дополнительно работает 10 мин. Публикуются p50/p95/p99, максимум, межпрогонный разброс, повторы, drops и причины потерь. CPU submission и GPU execution разделяются; timer queries считываются асинхронно. Медленный CPU-эталон проверяет правильность и не доказывает общее превосходство GPU над оптимизированным CPU.</w:t>
+      </w:r>
+    </w:p>
+    <w:p>
+      <w:pPr>
+        <w:pStyle w:val="Heading1"/>
+        <w:jc w:val="left"/>
+        <w:spacing w:after="100" w:line="276" w:lineRule="auto"/>
+        <w:widowControl/>
+        <w:keepNext/>
+      </w:pPr>
+      <w:r>
+        <w:t>10. Обязательный результат и границы</w:t>
+      </w:r>
+    </w:p>
+    <w:p>
+      <w:pPr>
+        <w:jc w:val="left"/>
+        <w:spacing w:after="100" w:line="276" w:lineRule="auto"/>
+        <w:widowControl/>
+      </w:pPr>
+      <w:r>
+        <w:t>Исследовательское ядро: одна точно определённая fisheye-модель, параметрическая bowl, равномерная и исследуемая дискретизация, независимый CPU-эталон, четыре GPU-входа, маски и нормализованное смешивание, ограниченная виртуальная камера и основной сравнительный эксперимент.</w:t>
+      </w:r>
+    </w:p>
+    <w:p>
+      <w:pPr>
+        <w:jc w:val="left"/>
+        <w:spacing w:after="100" w:line="276" w:lineRule="auto"/>
+        <w:widowControl/>
+      </w:pPr>
+      <w:r>
+        <w:t>Минимальный демонстрационный стенд: отдельные sv-server и sv-ui на Qt Quick (QML), локальный replay без simulator-процесса, лёгкий producer, измерение пути до представления, ограниченные очереди и диагностика потери камер. Чтение готового набора обязательно; собственный recorder желателен и имеет одну границу записи — нормализованные принятые входы сервера. Смена адаптера между запусками обязательна; hot-swap не требуется.</w:t>
+      </w:r>
+    </w:p>
+    <w:p>
+      <w:pPr>
+        <w:jc w:val="left"/>
+        <w:spacing w:after="100" w:line="276" w:lineRule="auto"/>
+        <w:widowControl/>
+      </w:pPr>
+      <w:r>
+        <w:t>Желательные интеграции — реальная запись и доступный live-адаптер, GPU-обмен при установленном узком месте, CAN/сенсор только для конкретного сценария, например выбора заднего ракурса. Полный интерактивный 3D-мир, игровая физика, pan, горячая калибровка и другой графический API являются дополнительными возможностями. Два физических компьютера и конкретное головное устройство не входят в минимальную приёмку без внешнего требования.</w:t>
+      </w:r>
+    </w:p>
+    <w:p>
+      <w:pPr>
+        <w:jc w:val="left"/>
+        <w:spacing w:after="100" w:line="276" w:lineRule="auto"/>
+        <w:widowControl/>
+      </w:pPr>
+      <w:r>
+        <w:t>В основную область не входят SLAM, восстановление глубины и скрытых областей, собственные нейросети, полноценная реконструкция окружения, разработка общего CAN-стека, аппаратная синхронизация и функциональная сертификация. Ограничения условной поверхности, фотометрии и синтетических данных явно включаются в выводы.</w:t>
+      </w:r>
+    </w:p>
+    <w:p>
+      <w:pPr>
+        <w:pStyle w:val="Heading1"/>
+        <w:jc w:val="left"/>
+        <w:spacing w:after="100" w:line="276" w:lineRule="auto"/>
+        <w:widowControl/>
+        <w:keepNext/>
+      </w:pPr>
+      <w:r>
+        <w:t>11. План выполнения и критерий завершения</w:t>
+      </w:r>
+    </w:p>
+    <w:p>
+      <w:pPr>
+        <w:jc w:val="left"/>
+        <w:spacing w:after="100" w:line="276" w:lineRule="auto"/>
+        <w:widowControl/>
+      </w:pPr>
+      <w:r>
+        <w:t>Единственный календарный план хранится в MASTER_PLAN.md: 26 недель при ориентировочной занятости 20–25 часов в неделю, включая четыре недели резерва. До GPU-разработки проверяются аппаратура, данные и CPU-модель; после четырёхкамерного baseline исследуется сетка, затем завершается интерактивный стенд и проводятся итоговые сравнения. Текст диссертации ведётся с первой недели. Конкретные даты привязываются к сроку защиты и доступу к оборудованию.</w:t>
+      </w:r>
+    </w:p>
+    <w:p>
+      <w:pPr>
+        <w:jc w:val="left"/>
+        <w:spacing w:after="100" w:line="276" w:lineRule="auto"/>
+        <w:widowControl/>
+      </w:pPr>
+      <w:r>
+        <w:t>Приёмка требует реализованного поведения и свидетельств по матрице VALIDATION.md: тестов, инспекции либо измерительных протоколов с фактическими значениями. Наличие тестового файла само по себе не подтверждает требование. Все параметры опыта, версии и хэши данных сохраняются. При отрицательном результате гипотезы публикуются количественные выводы и причины; расширения стенда не подменяют основной эксперимент.</w:t>
+      </w:r>
+    </w:p>
+    <w:p>
+      <w:pPr>
+        <w:jc w:val="left"/>
+        <w:spacing w:after="100" w:line="276" w:lineRule="auto"/>
+        <w:widowControl/>
+      </w:pPr>
+      <w:r>
+        <w:t>Связанные документы: REQUIREMENTS.md — объём и задачи R1–R6; COORDINATE_SYSTEMS.md — математика; SYSTEM_ARCHITECTURE.md — компоненты и ADR; RESEARCH_PLAN.md — программа опытов; VALIDATION.md — паспорт и матрица; requirements/ — контрактные требования компонентов. Оформление этой рабочей концепции единообразно; соответствие конкретному шаблону кафедры проверяется после получения её методических требований.</w:t>
+      </w:r>
+    </w:p>
+    <w:p>
+      <w:pPr>
+        <w:pStyle w:val="Heading1"/>
+        <w:jc w:val="left"/>
+        <w:spacing w:after="100" w:line="276" w:lineRule="auto"/>
+        <w:widowControl/>
+        <w:keepNext/>
+        <w:pageBreakBefore/>
+      </w:pPr>
+      <w:r>
+        <w:t>12. Источники</w:t>
+      </w:r>
+    </w:p>
+    <w:p>
+      <w:pPr>
+        <w:jc w:val="left"/>
+        <w:spacing w:after="100" w:line="276" w:lineRule="auto"/>
+        <w:widowControl/>
+      </w:pPr>
+      <w:r>
+        <w:t>Библиографические описания оформлены по ГОСТ Р 7.0.100–2018 [7]. Для сетевых ресурсов указаны URL и дата обращения. Технические сведения отделены от собственных проектных решений и предварительных численных целей.</w:t>
+      </w:r>
+    </w:p>
+    <w:p>
+      <w:pPr>
+        <w:pStyle w:val="ListParagraph"/>
+        <w:jc w:val="left"/>
+        <w:spacing w:after="100" w:line="276" w:lineRule="auto"/>
+        <w:widowControl/>
+        <w:numPr>
+          <w:ilvl w:val="0"/>
+          <w:numId w:val="15"/>
+        </w:numPr>
+        <w:ind w:left="480" w:hanging="480"/>
       </w:pPr>
       <w:r>
         <w:rPr>
-          <w:rFonts w:ascii="Times New Roman" w:hAnsi="Times New Roman" w:eastAsia="Times New Roman"/>
-          <w:sz w:val="28"/>
+          <w:sz w:val="22"/>
         </w:rPr>
-        <w:t>Для сохранения реализуемости проекта в течение одного учебного года в основную область работы не включаются разработка собственных нейронных сетей, полноценная трехмерная реконструкция окружающей среды, SLAM, разработка гипервизора или отдельной операционной системы, аппаратная синхронизация автомобильных сенсоров и функциональная сертификация по ISO 26262. Эти направления могут рассматриваться как внешние источники данных, инфраструктура целевой платформы или дальнейшее развитие проекта.</w:t>
+        <w:t>Surround view camera system for ADAS on TI’s TDAx SoCs / V. Appia, H. Hariyani, S. Sivasankaran [et al.]. – Texas Instruments, 2015. – 18 p. – SPRY270A. – URL: https://www.ti.com/lit/wp/spry270a/spry270a.pdf (дата обращения: 19.09.2026). – Текст : электронный.</w:t>
+      </w:r>
+    </w:p>
+    <w:p>
+      <w:pPr>
+        <w:pStyle w:val="ListParagraph"/>
+        <w:jc w:val="left"/>
+        <w:spacing w:after="100" w:line="276" w:lineRule="auto"/>
+        <w:widowControl/>
+        <w:numPr>
+          <w:ilvl w:val="0"/>
+          <w:numId w:val="15"/>
+        </w:numPr>
+        <w:ind w:left="480" w:hanging="480"/>
+      </w:pPr>
+      <w:r>
+        <w:rPr>
+          <w:sz w:val="22"/>
+        </w:rPr>
+        <w:t>3D Surround View Application / Texas Instruments. – Текст : электронный // Vision Apps User Guide. – URL: https://software-dl.ti.com/jacinto7/esd/processor-sdk-rtos-j721s2/latest/exports/docs/vision_apps/docs/user_guide/group_apps_srv_demos_app_srv_camera.html (дата обращения: 19.09.2026).</w:t>
+      </w:r>
+    </w:p>
+    <w:p>
+      <w:pPr>
+        <w:pStyle w:val="ListParagraph"/>
+        <w:jc w:val="left"/>
+        <w:spacing w:after="100" w:line="276" w:lineRule="auto"/>
+        <w:widowControl/>
+        <w:numPr>
+          <w:ilvl w:val="0"/>
+          <w:numId w:val="15"/>
+        </w:numPr>
+        <w:ind w:left="480" w:hanging="480"/>
+      </w:pPr>
+      <w:r>
+        <w:rPr>
+          <w:sz w:val="22"/>
+        </w:rPr>
+        <w:t>Fisheye camera model / OpenCV. – Текст : электронный // OpenCV 4.13.0 Documentation. – URL: https://docs.opencv.org/4.13.0/db/d58/group__calib3d__fisheye.html (дата обращения: 19.09.2026).</w:t>
+      </w:r>
+    </w:p>
+    <w:p>
+      <w:pPr>
+        <w:pStyle w:val="ListParagraph"/>
+        <w:jc w:val="left"/>
+        <w:spacing w:after="100" w:line="276" w:lineRule="auto"/>
+        <w:widowControl/>
+        <w:numPr>
+          <w:ilvl w:val="0"/>
+          <w:numId w:val="15"/>
+        </w:numPr>
+        <w:ind w:left="480" w:hanging="480"/>
+      </w:pPr>
+      <w:r>
+        <w:rPr>
+          <w:sz w:val="22"/>
+        </w:rPr>
+        <w:t>Qt Quick / The Qt Company. – Текст : электронный // Qt 5.15 Documentation. – URL: https://doc.qt.io/archives/qt-5.15/qtquick-index.html (дата обращения: 19.09.2026).</w:t>
+      </w:r>
+    </w:p>
+    <w:p>
+      <w:pPr>
+        <w:pStyle w:val="ListParagraph"/>
+        <w:jc w:val="left"/>
+        <w:spacing w:after="100" w:line="276" w:lineRule="auto"/>
+        <w:widowControl/>
+        <w:numPr>
+          <w:ilvl w:val="0"/>
+          <w:numId w:val="15"/>
+        </w:numPr>
+        <w:ind w:left="480" w:hanging="480"/>
+      </w:pPr>
+      <w:r>
+        <w:rPr>
+          <w:sz w:val="22"/>
+        </w:rPr>
+        <w:t>clock_gettime(3) : Linux manual page. – Текст : электронный // Linux man-pages. – URL: https://man7.org/linux/man-pages/man3/clock_gettime.3.html (дата обращения: 19.09.2026).</w:t>
+      </w:r>
+    </w:p>
+    <w:p>
+      <w:pPr>
+        <w:pStyle w:val="ListParagraph"/>
+        <w:jc w:val="left"/>
+        <w:spacing w:after="100" w:line="276" w:lineRule="auto"/>
+        <w:widowControl/>
+        <w:numPr>
+          <w:ilvl w:val="0"/>
+          <w:numId w:val="15"/>
+        </w:numPr>
+        <w:ind w:left="480" w:hanging="480"/>
+      </w:pPr>
+      <w:r>
+        <w:rPr>
+          <w:sz w:val="22"/>
+        </w:rPr>
+        <w:t>QQuickWindow Class / The Qt Company. – Текст : электронный // Qt Quick 5.15 Documentation. – URL: https://doc.qt.io/archives/qt-5.15/qquickwindow.html (дата обращения: 19.09.2026).</w:t>
+      </w:r>
+    </w:p>
+    <w:p>
+      <w:pPr>
+        <w:pStyle w:val="ListParagraph"/>
+        <w:jc w:val="left"/>
+        <w:spacing w:after="100" w:line="276" w:lineRule="auto"/>
+        <w:widowControl/>
+        <w:numPr>
+          <w:ilvl w:val="0"/>
+          <w:numId w:val="15"/>
+        </w:numPr>
+        <w:ind w:left="480" w:hanging="480"/>
+      </w:pPr>
+      <w:r>
+        <w:rPr>
+          <w:sz w:val="22"/>
+        </w:rPr>
+        <w:t>ГОСТ Р 7.0.100–2018. Система стандартов по информации, библиотечному и издательскому делу. Библиографическая запись. Библиографическое описание. Общие требования и правила составления : национальный стандарт Российской Федерации : дата введения 2019-07-01. – Москва : Стандартинформ, 2018. – URL: https://docs.cntd.ru/document/1200161674 (дата обращения: 19.09.2026). – Текст : электронный.</w:t>
       </w:r>
     </w:p>
     <w:sectPr>
       <w:footerReference w:type="default" r:id="rId9"/>
-      <w:pgSz w:w="12240" w:h="15840"/>
+      <w:pgSz w:w="11906" w:h="16838"/>
       <w:pgMar w:top="1134" w:right="850" w:bottom="1134" w:left="1701" w:header="720" w:footer="720" w:gutter="0"/>
       <w:cols w:space="720"/>
       <w:docGrid w:linePitch="360"/>
@@ -1241,6 +1108,138 @@
   </w:num>
   <w:num w:numId="9">
     <w:abstractNumId w:val="0"/>
+  </w:num>
+  <w:abstractNum w:abstractNumId="9">
+    <w:multiLevelType w:val="singleLevel"/>
+    <w:lvl w:ilvl="0">
+      <w:start w:val="1"/>
+      <w:numFmt w:val="decimal"/>
+      <w:lvlText w:val="%1."/>
+      <w:lvlJc w:val="left"/>
+      <w:suff w:val="tab"/>
+      <w:pPr>
+        <w:tabs>
+          <w:tab w:val="num" w:pos="480"/>
+        </w:tabs>
+        <w:ind w:left="480" w:hanging="480"/>
+      </w:pPr>
+    </w:lvl>
+  </w:abstractNum>
+  <w:num w:numId="10">
+    <w:abstractNumId w:val="9"/>
+    <w:lvlOverride w:ilvl="0">
+      <w:startOverride w:val="1"/>
+    </w:lvlOverride>
+  </w:num>
+  <w:abstractNum w:abstractNumId="10">
+    <w:multiLevelType w:val="singleLevel"/>
+    <w:lvl w:ilvl="0">
+      <w:start w:val="1"/>
+      <w:numFmt w:val="decimal"/>
+      <w:lvlText w:val="%1."/>
+      <w:lvlJc w:val="left"/>
+      <w:suff w:val="tab"/>
+      <w:pPr>
+        <w:tabs>
+          <w:tab w:val="num" w:pos="480"/>
+        </w:tabs>
+        <w:ind w:left="480" w:hanging="480"/>
+      </w:pPr>
+    </w:lvl>
+  </w:abstractNum>
+  <w:num w:numId="11">
+    <w:abstractNumId w:val="10"/>
+    <w:lvlOverride w:ilvl="0">
+      <w:startOverride w:val="1"/>
+    </w:lvlOverride>
+  </w:num>
+  <w:abstractNum w:abstractNumId="11">
+    <w:multiLevelType w:val="singleLevel"/>
+    <w:lvl w:ilvl="0">
+      <w:start w:val="1"/>
+      <w:numFmt w:val="decimal"/>
+      <w:lvlText w:val="%1."/>
+      <w:lvlJc w:val="left"/>
+      <w:suff w:val="tab"/>
+      <w:pPr>
+        <w:tabs>
+          <w:tab w:val="num" w:pos="480"/>
+        </w:tabs>
+        <w:ind w:left="480" w:hanging="480"/>
+      </w:pPr>
+    </w:lvl>
+  </w:abstractNum>
+  <w:num w:numId="12">
+    <w:abstractNumId w:val="11"/>
+    <w:lvlOverride w:ilvl="0">
+      <w:startOverride w:val="1"/>
+    </w:lvlOverride>
+  </w:num>
+  <w:abstractNum w:abstractNumId="12">
+    <w:multiLevelType w:val="singleLevel"/>
+    <w:lvl w:ilvl="0">
+      <w:start w:val="1"/>
+      <w:numFmt w:val="decimal"/>
+      <w:lvlText w:val="%1."/>
+      <w:lvlJc w:val="left"/>
+      <w:suff w:val="tab"/>
+      <w:pPr>
+        <w:tabs>
+          <w:tab w:val="num" w:pos="480"/>
+        </w:tabs>
+        <w:ind w:left="480" w:hanging="480"/>
+      </w:pPr>
+    </w:lvl>
+  </w:abstractNum>
+  <w:num w:numId="13">
+    <w:abstractNumId w:val="12"/>
+    <w:lvlOverride w:ilvl="0">
+      <w:startOverride w:val="1"/>
+    </w:lvlOverride>
+  </w:num>
+  <w:abstractNum w:abstractNumId="13">
+    <w:multiLevelType w:val="singleLevel"/>
+    <w:lvl w:ilvl="0">
+      <w:start w:val="1"/>
+      <w:numFmt w:val="decimal"/>
+      <w:lvlText w:val="%1."/>
+      <w:lvlJc w:val="left"/>
+      <w:suff w:val="tab"/>
+      <w:pPr>
+        <w:tabs>
+          <w:tab w:val="num" w:pos="480"/>
+        </w:tabs>
+        <w:ind w:left="480" w:hanging="480"/>
+      </w:pPr>
+    </w:lvl>
+  </w:abstractNum>
+  <w:num w:numId="14">
+    <w:abstractNumId w:val="13"/>
+    <w:lvlOverride w:ilvl="0">
+      <w:startOverride w:val="1"/>
+    </w:lvlOverride>
+  </w:num>
+  <w:abstractNum w:abstractNumId="14">
+    <w:multiLevelType w:val="singleLevel"/>
+    <w:lvl w:ilvl="0">
+      <w:start w:val="1"/>
+      <w:numFmt w:val="decimal"/>
+      <w:lvlText w:val="%1."/>
+      <w:lvlJc w:val="left"/>
+      <w:suff w:val="tab"/>
+      <w:pPr>
+        <w:tabs>
+          <w:tab w:val="num" w:pos="480"/>
+        </w:tabs>
+        <w:ind w:left="480" w:hanging="480"/>
+      </w:pPr>
+    </w:lvl>
+  </w:abstractNum>
+  <w:num w:numId="15">
+    <w:abstractNumId w:val="14"/>
+    <w:lvlOverride w:ilvl="0">
+      <w:startOverride w:val="1"/>
+    </w:lvlOverride>
   </w:num>
 </w:numbering>
 </file>
@@ -1406,8 +1405,11 @@
     <w:qFormat/>
     <w:rsid w:val="00FC693F"/>
     <w:rPr>
-      <w:rFonts w:ascii="Times New Roman" w:hAnsi="Times New Roman"/>
-      <w:sz w:val="28"/>
+      <w:rFonts w:ascii="Times New Roman" w:hAnsi="Times New Roman" w:cs="Times New Roman"/>
+      <w:sz w:val="24"/>
+      <w:szCs w:val="24"/>
+      <w:color w:val="000000"/>
+      <w:lang w:val="ru-RU"/>
     </w:rPr>
   </w:style>
   <w:style w:type="paragraph" w:styleId="Header">
@@ -1469,12 +1471,13 @@
       <w:outlineLvl w:val="0"/>
     </w:pPr>
     <w:rPr>
-      <w:rFonts w:asciiTheme="majorHAnsi" w:eastAsiaTheme="majorEastAsia" w:hAnsiTheme="majorHAnsi" w:cstheme="majorBidi" w:ascii="Times New Roman" w:hAnsi="Times New Roman"/>
       <w:b/>
       <w:bCs/>
-      <w:color w:val="365F91" w:themeColor="accent1" w:themeShade="BF"/>
-      <w:sz w:val="32"/>
+      <w:rFonts w:ascii="Times New Roman" w:hAnsi="Times New Roman" w:cs="Times New Roman"/>
+      <w:sz w:val="28"/>
       <w:szCs w:val="28"/>
+      <w:color w:val="000000"/>
+      <w:lang w:val="ru-RU"/>
     </w:rPr>
   </w:style>
   <w:style w:type="paragraph" w:styleId="Heading2">
@@ -1493,12 +1496,13 @@
       <w:outlineLvl w:val="1"/>
     </w:pPr>
     <w:rPr>
-      <w:rFonts w:asciiTheme="majorHAnsi" w:eastAsiaTheme="majorEastAsia" w:hAnsiTheme="majorHAnsi" w:cstheme="majorBidi" w:ascii="Times New Roman" w:hAnsi="Times New Roman"/>
       <w:b/>
       <w:bCs/>
-      <w:color w:val="4F81BD" w:themeColor="accent1"/>
-      <w:sz w:val="28"/>
-      <w:szCs w:val="26"/>
+      <w:rFonts w:ascii="Times New Roman" w:hAnsi="Times New Roman" w:cs="Times New Roman"/>
+      <w:sz w:val="24"/>
+      <w:szCs w:val="24"/>
+      <w:color w:val="000000"/>
+      <w:lang w:val="ru-RU"/>
     </w:rPr>
   </w:style>
   <w:style w:type="paragraph" w:styleId="Heading3">
@@ -1758,13 +1762,14 @@
       <w:contextualSpacing/>
     </w:pPr>
     <w:rPr>
-      <w:rFonts w:asciiTheme="majorHAnsi" w:eastAsiaTheme="majorEastAsia" w:hAnsiTheme="majorHAnsi" w:cstheme="majorBidi" w:ascii="Times New Roman" w:hAnsi="Times New Roman"/>
       <w:b/>
-      <w:color w:val="17365D" w:themeColor="text2" w:themeShade="BF"/>
       <w:spacing w:val="5"/>
       <w:kern w:val="28"/>
-      <w:sz w:val="36"/>
-      <w:szCs w:val="52"/>
+      <w:rFonts w:ascii="Times New Roman" w:hAnsi="Times New Roman" w:cs="Times New Roman"/>
+      <w:sz w:val="32"/>
+      <w:szCs w:val="32"/>
+      <w:color w:val="000000"/>
+      <w:lang w:val="ru-RU"/>
     </w:rPr>
   </w:style>
   <w:style w:type="character" w:customStyle="1" w:styleId="TitleChar">
@@ -1796,13 +1801,14 @@
       </w:numPr>
     </w:pPr>
     <w:rPr>
-      <w:rFonts w:asciiTheme="majorHAnsi" w:eastAsiaTheme="majorEastAsia" w:hAnsiTheme="majorHAnsi" w:cstheme="majorBidi"/>
       <w:i/>
       <w:iCs/>
-      <w:color w:val="4F81BD" w:themeColor="accent1"/>
       <w:spacing w:val="15"/>
+      <w:rFonts w:ascii="Times New Roman" w:hAnsi="Times New Roman" w:cs="Times New Roman"/>
       <w:sz w:val="24"/>
       <w:szCs w:val="24"/>
+      <w:color w:val="000000"/>
+      <w:lang w:val="ru-RU"/>
     </w:rPr>
   </w:style>
   <w:style w:type="character" w:customStyle="1" w:styleId="SubtitleChar">
@@ -1831,6 +1837,13 @@
       <w:ind w:left="720"/>
       <w:contextualSpacing/>
     </w:pPr>
+    <w:rPr>
+      <w:rFonts w:ascii="Times New Roman" w:hAnsi="Times New Roman" w:cs="Times New Roman"/>
+      <w:sz w:val="24"/>
+      <w:szCs w:val="24"/>
+      <w:color w:val="000000"/>
+      <w:lang w:val="ru-RU"/>
+    </w:rPr>
   </w:style>
   <w:style w:type="paragraph" w:styleId="BodyText">
     <w:name w:val="Body Text"/>

</xml_diff>